<commit_message>
fix: don't define built-in Word styles in generic parser output
Writing an empty Style(style_id='Heading1') to styles.xml overrides
Word's built-in Heading 1 (bold, large font, spacing) with a blank
definition. Omitting built-in styles from doc.styles lets Word apply
its own formatting. Adds _BUILTIN_WORD_STYLES set for the 18 most
common built-in style IDs.

Co-Authored-By: Claude Sonnet 4.6 <noreply@anthropic.com>
</commit_message>
<xml_diff>
--- a/tests/fixtures/generic_showcase.docx
+++ b/tests/fixtures/generic_showcase.docx
@@ -362,23 +362,5 @@
       <w:szCs w:val="22"/>
     </w:rPr>
   </w:style>
-  <w:style w:type="paragraph" w:styleId="Heading1">
-    <w:name w:val="Heading1"/>
-  </w:style>
-  <w:style w:type="paragraph" w:styleId="Heading2">
-    <w:name w:val="Heading2"/>
-  </w:style>
-  <w:style w:type="paragraph" w:styleId="Heading3">
-    <w:name w:val="Heading3"/>
-  </w:style>
-  <w:style w:type="paragraph" w:styleId="Heading4">
-    <w:name w:val="Heading4"/>
-  </w:style>
-  <w:style w:type="paragraph" w:styleId="Heading5">
-    <w:name w:val="Heading5"/>
-  </w:style>
-  <w:style w:type="paragraph" w:styleId="Heading6">
-    <w:name w:val="Heading6"/>
-  </w:style>
 </w:styles>
 </file>
</xml_diff>

<commit_message>
feat: inline element parsing for generic HTML→DOCX (Phase 2 sub-feature 4)
Replace the plain-text run builder with a full inline content walker that
handles b/strong, i/em/cite, u/ins, s/del/strike, code/kbd/samp, mark,
sub, sup, abbr as semantic formatting; span with CSS properties (font-weight,
font-style, text-decoration, font-size, font-family, color, background-color,
vertical-align, font-variant, text-transform); and <a href> as Hyperlink.

Formatting accumulates through nesting — <b><i>text</i></b> produces bold+italic.
Tail text after inline children inherits the parent's (not the child's) formatting.

59 new tests added; all 2367 pass at 96.23% coverage.

Co-Authored-By: Claude Sonnet 4.6 <noreply@anthropic.com>
</commit_message>
<xml_diff>
--- a/tests/fixtures/generic_showcase.docx
+++ b/tests/fixtures/generic_showcase.docx
@@ -292,6 +292,493 @@
       </w:pPr>
       <w:r>
         <w:t xml:space="preserve">Inline style: centred + 36pt indent.</w:t>
+      </w:r>
+    </w:p>
+    <w:p>
+      <w:pPr>
+        <w:pStyle w:val="Heading2"/>
+      </w:pPr>
+      <w:r>
+        <w:t xml:space="preserve">Inline Elements — Semantic Tags</w:t>
+      </w:r>
+    </w:p>
+    <w:p>
+      <w:pPr/>
+      <w:r>
+        <w:rPr>
+          <w:b/>
+        </w:rPr>
+        <w:t xml:space="preserve">Bold via &lt;b&gt;</w:t>
+      </w:r>
+      <w:r>
+        <w:t xml:space="preserve"> and </w:t>
+      </w:r>
+      <w:r>
+        <w:rPr>
+          <w:b/>
+        </w:rPr>
+        <w:t xml:space="preserve">bold via &lt;strong&gt;</w:t>
+      </w:r>
+      <w:r>
+        <w:t xml:space="preserve">.</w:t>
+      </w:r>
+    </w:p>
+    <w:p>
+      <w:pPr/>
+      <w:r>
+        <w:rPr>
+          <w:i/>
+        </w:rPr>
+        <w:t xml:space="preserve">Italic via &lt;i&gt;</w:t>
+      </w:r>
+      <w:r>
+        <w:t xml:space="preserve"> and </w:t>
+      </w:r>
+      <w:r>
+        <w:rPr>
+          <w:i/>
+        </w:rPr>
+        <w:t xml:space="preserve">italic via &lt;em&gt;</w:t>
+      </w:r>
+      <w:r>
+        <w:t xml:space="preserve">.</w:t>
+      </w:r>
+    </w:p>
+    <w:p>
+      <w:pPr/>
+      <w:r>
+        <w:rPr>
+          <w:u w:val="single"/>
+        </w:rPr>
+        <w:t xml:space="preserve">Underline via &lt;u&gt;</w:t>
+      </w:r>
+      <w:r>
+        <w:t xml:space="preserve"> and </w:t>
+      </w:r>
+      <w:r>
+        <w:rPr>
+          <w:u w:val="single"/>
+        </w:rPr>
+        <w:t xml:space="preserve">underline via &lt;ins&gt;</w:t>
+      </w:r>
+      <w:r>
+        <w:t xml:space="preserve">.</w:t>
+      </w:r>
+    </w:p>
+    <w:p>
+      <w:pPr/>
+      <w:r>
+        <w:rPr>
+          <w:strike/>
+        </w:rPr>
+        <w:t xml:space="preserve">Strikethrough via &lt;s&gt;</w:t>
+      </w:r>
+      <w:r>
+        <w:t xml:space="preserve"> and </w:t>
+      </w:r>
+      <w:r>
+        <w:rPr>
+          <w:strike/>
+        </w:rPr>
+        <w:t xml:space="preserve">strike via &lt;del&gt;</w:t>
+      </w:r>
+      <w:r>
+        <w:t xml:space="preserve">.</w:t>
+      </w:r>
+    </w:p>
+    <w:p>
+      <w:pPr/>
+      <w:r>
+        <w:t xml:space="preserve">Code: </w:t>
+      </w:r>
+      <w:r>
+        <w:rPr>
+          <w:rFonts w:ascii="Courier New" w:hAnsi="Courier New"/>
+        </w:rPr>
+        <w:t xml:space="preserve">print("hello")</w:t>
+      </w:r>
+      <w:r>
+        <w:t xml:space="preserve"> and keyboard: </w:t>
+      </w:r>
+      <w:r>
+        <w:rPr>
+          <w:rFonts w:ascii="Courier New" w:hAnsi="Courier New"/>
+        </w:rPr>
+        <w:t xml:space="preserve">Ctrl+C</w:t>
+      </w:r>
+      <w:r>
+        <w:t xml:space="preserve">.</w:t>
+      </w:r>
+    </w:p>
+    <w:p>
+      <w:pPr/>
+      <w:r>
+        <w:t xml:space="preserve">Highlighted: </w:t>
+      </w:r>
+      <w:r>
+        <w:rPr>
+          <w:highlight w:val="yellow"/>
+        </w:rPr>
+        <w:t xml:space="preserve">important text</w:t>
+      </w:r>
+      <w:r>
+        <w:t xml:space="preserve"> in yellow.</w:t>
+      </w:r>
+    </w:p>
+    <w:p>
+      <w:pPr/>
+      <w:r>
+        <w:t xml:space="preserve">Chemical formula: H</w:t>
+      </w:r>
+      <w:r>
+        <w:rPr>
+          <w:vertAlign w:val="subscript"/>
+        </w:rPr>
+        <w:t xml:space="preserve">2</w:t>
+      </w:r>
+      <w:r>
+        <w:t xml:space="preserve">O. Einstein: E=mc</w:t>
+      </w:r>
+      <w:r>
+        <w:rPr>
+          <w:vertAlign w:val="superscript"/>
+        </w:rPr>
+        <w:t xml:space="preserve">2</w:t>
+      </w:r>
+      <w:r>
+        <w:t xml:space="preserve">.</w:t>
+      </w:r>
+    </w:p>
+    <w:p>
+      <w:pPr/>
+      <w:r>
+        <w:t xml:space="preserve">Mixed: </w:t>
+      </w:r>
+      <w:r>
+        <w:rPr>
+          <w:b/>
+        </w:rPr>
+        <w:t xml:space="preserve">bold</w:t>
+      </w:r>
+      <w:r>
+        <w:t xml:space="preserve">, </w:t>
+      </w:r>
+      <w:r>
+        <w:rPr>
+          <w:i/>
+        </w:rPr>
+        <w:t xml:space="preserve">italic</w:t>
+      </w:r>
+      <w:r>
+        <w:t xml:space="preserve">, </w:t>
+      </w:r>
+      <w:r>
+        <w:rPr>
+          <w:b/>
+          <w:i/>
+        </w:rPr>
+        <w:t xml:space="preserve">bold-italic</w:t>
+      </w:r>
+      <w:r>
+        <w:t xml:space="preserve">, and plain text.</w:t>
+      </w:r>
+    </w:p>
+    <w:p>
+      <w:pPr>
+        <w:pStyle w:val="Heading2"/>
+      </w:pPr>
+      <w:r>
+        <w:t xml:space="preserve">Inline Elements — CSS on &lt;span&gt;</w:t>
+      </w:r>
+    </w:p>
+    <w:p>
+      <w:pPr/>
+      <w:r>
+        <w:t xml:space="preserve"> </w:t>
+      </w:r>
+      <w:r>
+        <w:rPr>
+          <w:b/>
+        </w:rPr>
+        <w:t xml:space="preserve">CSS bold</w:t>
+      </w:r>
+      <w:r>
+        <w:t xml:space="preserve">, </w:t>
+      </w:r>
+      <w:r>
+        <w:rPr>
+          <w:i/>
+        </w:rPr>
+        <w:t xml:space="preserve">CSS italic</w:t>
+      </w:r>
+      <w:r>
+        <w:t xml:space="preserve">, </w:t>
+      </w:r>
+      <w:r>
+        <w:rPr>
+          <w:u w:val="single"/>
+        </w:rPr>
+        <w:t xml:space="preserve">CSS underline</w:t>
+      </w:r>
+      <w:r>
+        <w:t xml:space="preserve">, </w:t>
+      </w:r>
+      <w:r>
+        <w:rPr>
+          <w:strike/>
+        </w:rPr>
+        <w:t xml:space="preserve">CSS strikethrough</w:t>
+      </w:r>
+      <w:r>
+        <w:t xml:space="preserve">. </w:t>
+      </w:r>
+    </w:p>
+    <w:p>
+      <w:pPr/>
+      <w:r>
+        <w:t xml:space="preserve"> </w:t>
+      </w:r>
+      <w:r>
+        <w:rPr>
+          <w:color w:val="C00000"/>
+        </w:rPr>
+        <w:t xml:space="preserve">Red text (#C00000)</w:t>
+      </w:r>
+      <w:r>
+        <w:t xml:space="preserve">, </w:t>
+      </w:r>
+      <w:r>
+        <w:rPr>
+          <w:color w:val="0070C0"/>
+        </w:rPr>
+        <w:t xml:space="preserve">Blue text (rgb)</w:t>
+      </w:r>
+      <w:r>
+        <w:t xml:space="preserve">, </w:t>
+      </w:r>
+      <w:r>
+        <w:rPr>
+          <w:color w:val="008000"/>
+        </w:rPr>
+        <w:t xml:space="preserve">Named green</w:t>
+      </w:r>
+      <w:r>
+        <w:t xml:space="preserve">. </w:t>
+      </w:r>
+    </w:p>
+    <w:p>
+      <w:pPr/>
+      <w:r>
+        <w:t xml:space="preserve"> </w:t>
+      </w:r>
+      <w:r>
+        <w:rPr>
+          <w:sz w:val="36"/>
+        </w:rPr>
+        <w:t xml:space="preserve">18pt text</w:t>
+      </w:r>
+      <w:r>
+        <w:t xml:space="preserve">, </w:t>
+      </w:r>
+      <w:r>
+        <w:rPr>
+          <w:sz w:val="20"/>
+        </w:rPr>
+        <w:t xml:space="preserve">10pt text</w:t>
+      </w:r>
+      <w:r>
+        <w:t xml:space="preserve">, </w:t>
+      </w:r>
+      <w:r>
+        <w:rPr>
+          <w:rFonts w:ascii="Georgia" w:hAnsi="Georgia"/>
+        </w:rPr>
+        <w:t xml:space="preserve">Georgia font</w:t>
+      </w:r>
+      <w:r>
+        <w:t xml:space="preserve">. </w:t>
+      </w:r>
+    </w:p>
+    <w:p>
+      <w:pPr/>
+      <w:r>
+        <w:t xml:space="preserve"> </w:t>
+      </w:r>
+      <w:r>
+        <w:rPr>
+          <w:highlight w:val="yellow"/>
+        </w:rPr>
+        <w:t xml:space="preserve">Yellow highlight via CSS</w:t>
+      </w:r>
+      <w:r>
+        <w:t xml:space="preserve">, </w:t>
+      </w:r>
+      <w:r>
+        <w:rPr>
+          <w:highlight w:val="cyan"/>
+        </w:rPr>
+        <w:t xml:space="preserve">Cyan highlight via hex</w:t>
+      </w:r>
+      <w:r>
+        <w:t xml:space="preserve">. </w:t>
+      </w:r>
+    </w:p>
+    <w:p>
+      <w:pPr/>
+      <w:r>
+        <w:t xml:space="preserve"> </w:t>
+      </w:r>
+      <w:r>
+        <w:rPr>
+          <w:smallCaps/>
+        </w:rPr>
+        <w:t xml:space="preserve">Small caps via CSS</w:t>
+      </w:r>
+      <w:r>
+        <w:t xml:space="preserve">, </w:t>
+      </w:r>
+      <w:r>
+        <w:rPr>
+          <w:caps/>
+        </w:rPr>
+        <w:t xml:space="preserve">all caps via CSS</w:t>
+      </w:r>
+      <w:r>
+        <w:t xml:space="preserve">, </w:t>
+      </w:r>
+      <w:r>
+        <w:rPr>
+          <w:vertAlign w:val="superscript"/>
+        </w:rPr>
+        <w:t xml:space="preserve">superscript</w:t>
+      </w:r>
+      <w:r>
+        <w:t xml:space="preserve"> and </w:t>
+      </w:r>
+      <w:r>
+        <w:rPr>
+          <w:vertAlign w:val="subscript"/>
+        </w:rPr>
+        <w:t xml:space="preserve">subscript</w:t>
+      </w:r>
+      <w:r>
+        <w:t xml:space="preserve">. </w:t>
+      </w:r>
+    </w:p>
+    <w:p>
+      <w:pPr>
+        <w:pStyle w:val="Heading2"/>
+      </w:pPr>
+      <w:r>
+        <w:t xml:space="preserve">Hyperlinks</w:t>
+      </w:r>
+    </w:p>
+    <w:p>
+      <w:pPr/>
+      <w:r>
+        <w:t xml:space="preserve">Visit </w:t>
+      </w:r>
+      <w:hyperlink r:id="rId3">
+        <w:r>
+          <w:t xml:space="preserve">docwow documentation</w:t>
+        </w:r>
+      </w:hyperlink>
+      <w:r>
+        <w:t xml:space="preserve"> for more.</w:t>
+      </w:r>
+    </w:p>
+    <w:p>
+      <w:pPr/>
+      <w:r>
+        <w:t xml:space="preserve">Bold link: </w:t>
+      </w:r>
+      <w:hyperlink r:id="rId4">
+        <w:r>
+          <w:rPr>
+            <w:b/>
+          </w:rPr>
+          <w:t xml:space="preserve">docwow on GitHub</w:t>
+        </w:r>
+      </w:hyperlink>
+      <w:r>
+        <w:t xml:space="preserve">.</w:t>
+      </w:r>
+    </w:p>
+    <w:p>
+      <w:pPr/>
+      <w:r>
+        <w:t xml:space="preserve">Email: </w:t>
+      </w:r>
+      <w:hyperlink r:id="rId5">
+        <w:r>
+          <w:t xml:space="preserve">hello@example.com</w:t>
+        </w:r>
+      </w:hyperlink>
+      <w:r>
+        <w:t xml:space="preserve">.</w:t>
+      </w:r>
+    </w:p>
+    <w:p>
+      <w:pPr>
+        <w:pStyle w:val="Heading2"/>
+      </w:pPr>
+      <w:r>
+        <w:t xml:space="preserve">Nested Inline Formatting</w:t>
+      </w:r>
+    </w:p>
+    <w:p>
+      <w:pPr/>
+      <w:r>
+        <w:rPr>
+          <w:b/>
+        </w:rPr>
+        <w:t xml:space="preserve">Outer bold — </w:t>
+      </w:r>
+      <w:r>
+        <w:rPr>
+          <w:b/>
+          <w:i/>
+        </w:rPr>
+        <w:t xml:space="preserve">inner bold-italic — </w:t>
+      </w:r>
+      <w:r>
+        <w:rPr>
+          <w:b/>
+          <w:i/>
+          <w:u w:val="single"/>
+        </w:rPr>
+        <w:t xml:space="preserve">innermost bold-italic-underline</w:t>
+      </w:r>
+      <w:r>
+        <w:t xml:space="preserve"> then plain.</w:t>
+      </w:r>
+    </w:p>
+    <w:p>
+      <w:pPr/>
+      <w:r>
+        <w:t xml:space="preserve">Tail text: </w:t>
+      </w:r>
+      <w:r>
+        <w:rPr>
+          <w:b/>
+        </w:rPr>
+        <w:t xml:space="preserve">bold </w:t>
+      </w:r>
+      <w:r>
+        <w:rPr>
+          <w:b/>
+          <w:i/>
+        </w:rPr>
+        <w:t xml:space="preserve">italic</w:t>
+      </w:r>
+      <w:r>
+        <w:rPr>
+          <w:b/>
+        </w:rPr>
+        <w:t xml:space="preserve"> still bold</w:t>
+      </w:r>
+      <w:r>
+        <w:t xml:space="preserve"> plain.</w:t>
       </w:r>
     </w:p>
     <w:sectPr>

</xml_diff>

<commit_message>
feat: list parsing for generic HTML→DOCX (Phase 2 sub-feature 5)
Parse <ul>/<ol>/<li> into Word list items with correct ListInfo (num_id,
level). Each top-level list gets its own NumberingDefinition (9 levels,
bullet for ul/decimal for ol). Nested lists reuse the parent's num_id
at depth+1, matching Word's multi-level list model. Inline formatting
inside <li> (bold, italic, hyperlinks, etc.) is fully supported.

31 new tests; all 2398 pass.

Co-Authored-By: Claude Sonnet 4.6 <noreply@anthropic.com>
</commit_message>
<xml_diff>
--- a/tests/fixtures/generic_showcase.docx
+++ b/tests/fixtures/generic_showcase.docx
@@ -265,6 +265,212 @@
         <w:pStyle w:val="Heading2"/>
       </w:pPr>
       <w:r>
+        <w:t xml:space="preserve">Lists</w:t>
+      </w:r>
+    </w:p>
+    <w:p>
+      <w:pPr/>
+      <w:r>
+        <w:t xml:space="preserve">Bullet list:</w:t>
+      </w:r>
+    </w:p>
+    <w:p>
+      <w:pPr>
+        <w:numPr>
+          <w:ilvl w:val="0"/>
+          <w:numId w:val="1"/>
+        </w:numPr>
+      </w:pPr>
+      <w:r>
+        <w:t xml:space="preserve">Bullet item one</w:t>
+      </w:r>
+    </w:p>
+    <w:p>
+      <w:pPr>
+        <w:numPr>
+          <w:ilvl w:val="0"/>
+          <w:numId w:val="1"/>
+        </w:numPr>
+      </w:pPr>
+      <w:r>
+        <w:t xml:space="preserve">Bullet item two with </w:t>
+      </w:r>
+      <w:r>
+        <w:rPr>
+          <w:b/>
+        </w:rPr>
+        <w:t xml:space="preserve">bold</w:t>
+      </w:r>
+      <w:r>
+        <w:t xml:space="preserve"> text</w:t>
+      </w:r>
+    </w:p>
+    <w:p>
+      <w:pPr>
+        <w:numPr>
+          <w:ilvl w:val="0"/>
+          <w:numId w:val="1"/>
+        </w:numPr>
+      </w:pPr>
+      <w:r>
+        <w:t xml:space="preserve">Bullet item three </w:t>
+      </w:r>
+      <w:r>
+        <w:t xml:space="preserve"> </w:t>
+      </w:r>
+    </w:p>
+    <w:p>
+      <w:pPr>
+        <w:numPr>
+          <w:ilvl w:val="1"/>
+          <w:numId w:val="1"/>
+        </w:numPr>
+      </w:pPr>
+      <w:r>
+        <w:t xml:space="preserve">Nested bullet — level 2</w:t>
+      </w:r>
+    </w:p>
+    <w:p>
+      <w:pPr>
+        <w:numPr>
+          <w:ilvl w:val="1"/>
+          <w:numId w:val="1"/>
+        </w:numPr>
+      </w:pPr>
+      <w:r>
+        <w:t xml:space="preserve">Another nested item </w:t>
+      </w:r>
+      <w:r>
+        <w:t xml:space="preserve"> </w:t>
+      </w:r>
+    </w:p>
+    <w:p>
+      <w:pPr>
+        <w:numPr>
+          <w:ilvl w:val="2"/>
+          <w:numId w:val="1"/>
+        </w:numPr>
+      </w:pPr>
+      <w:r>
+        <w:t xml:space="preserve">Level 3 bullet</w:t>
+      </w:r>
+    </w:p>
+    <w:p>
+      <w:pPr>
+        <w:numPr>
+          <w:ilvl w:val="0"/>
+          <w:numId w:val="1"/>
+        </w:numPr>
+      </w:pPr>
+      <w:r>
+        <w:t xml:space="preserve">Back to level 1</w:t>
+      </w:r>
+    </w:p>
+    <w:p>
+      <w:pPr/>
+      <w:r>
+        <w:t xml:space="preserve">Numbered list:</w:t>
+      </w:r>
+    </w:p>
+    <w:p>
+      <w:pPr>
+        <w:numPr>
+          <w:ilvl w:val="0"/>
+          <w:numId w:val="2"/>
+        </w:numPr>
+      </w:pPr>
+      <w:r>
+        <w:t xml:space="preserve">Step one</w:t>
+      </w:r>
+    </w:p>
+    <w:p>
+      <w:pPr>
+        <w:numPr>
+          <w:ilvl w:val="0"/>
+          <w:numId w:val="2"/>
+        </w:numPr>
+      </w:pPr>
+      <w:r>
+        <w:t xml:space="preserve">Step two with </w:t>
+      </w:r>
+      <w:hyperlink r:id="rId4">
+        <w:r>
+          <w:t xml:space="preserve">a link</w:t>
+        </w:r>
+      </w:hyperlink>
+    </w:p>
+    <w:p>
+      <w:pPr>
+        <w:numPr>
+          <w:ilvl w:val="0"/>
+          <w:numId w:val="2"/>
+        </w:numPr>
+      </w:pPr>
+      <w:r>
+        <w:t xml:space="preserve">Step three </w:t>
+      </w:r>
+      <w:r>
+        <w:t xml:space="preserve"> </w:t>
+      </w:r>
+    </w:p>
+    <w:p>
+      <w:pPr>
+        <w:numPr>
+          <w:ilvl w:val="1"/>
+          <w:numId w:val="2"/>
+        </w:numPr>
+      </w:pPr>
+      <w:r>
+        <w:t xml:space="preserve">Sub-step 3a</w:t>
+      </w:r>
+    </w:p>
+    <w:p>
+      <w:pPr>
+        <w:numPr>
+          <w:ilvl w:val="1"/>
+          <w:numId w:val="2"/>
+        </w:numPr>
+      </w:pPr>
+      <w:r>
+        <w:t xml:space="preserve">Sub-step 3b</w:t>
+      </w:r>
+    </w:p>
+    <w:p>
+      <w:pPr/>
+      <w:r>
+        <w:t xml:space="preserve">Mixed nesting (ul inside ol):</w:t>
+      </w:r>
+    </w:p>
+    <w:p>
+      <w:pPr>
+        <w:numPr>
+          <w:ilvl w:val="0"/>
+          <w:numId w:val="3"/>
+        </w:numPr>
+      </w:pPr>
+      <w:r>
+        <w:t xml:space="preserve">Ordered parent </w:t>
+      </w:r>
+      <w:r>
+        <w:t xml:space="preserve"> </w:t>
+      </w:r>
+    </w:p>
+    <w:p>
+      <w:pPr>
+        <w:numPr>
+          <w:ilvl w:val="1"/>
+          <w:numId w:val="3"/>
+        </w:numPr>
+      </w:pPr>
+      <w:r>
+        <w:t xml:space="preserve">Unordered child</w:t>
+      </w:r>
+    </w:p>
+    <w:p>
+      <w:pPr>
+        <w:pStyle w:val="Heading2"/>
+      </w:pPr>
+      <w:r>
         <w:t xml:space="preserve">CSS Resolution</w:t>
       </w:r>
     </w:p>
@@ -678,7 +884,7 @@
       <w:r>
         <w:t xml:space="preserve">Visit </w:t>
       </w:r>
-      <w:hyperlink r:id="rId3">
+      <w:hyperlink r:id="rId4">
         <w:r>
           <w:t xml:space="preserve">docwow documentation</w:t>
         </w:r>
@@ -692,7 +898,7 @@
       <w:r>
         <w:t xml:space="preserve">Bold link: </w:t>
       </w:r>
-      <w:hyperlink r:id="rId4">
+      <w:hyperlink r:id="rId5">
         <w:r>
           <w:rPr>
             <w:b/>
@@ -709,7 +915,7 @@
       <w:r>
         <w:t xml:space="preserve">Email: </w:t>
       </w:r>
-      <w:hyperlink r:id="rId5">
+      <w:hyperlink r:id="rId6">
         <w:r>
           <w:t xml:space="preserve">hello@example.com</w:t>
         </w:r>
@@ -787,6 +993,272 @@
     </w:sectPr>
   </w:body>
 </w:document>
+</file>
+
+<file path=word/numbering.xml><?xml version="1.0" encoding="utf-8"?>
+<w:numbering xmlns:w="http://schemas.openxmlformats.org/wordprocessingml/2006/main">
+  <w:abstractNum w:abstractNumId="1">
+    <w:multiLevelType w:val="hybridMultilevel"/>
+    <w:lvl w:ilvl="0">
+      <w:start w:val="1"/>
+      <w:numFmt w:val="bullet"/>
+      <w:lvlText w:val="•"/>
+      <w:lvlJc w:val="left"/>
+      <w:pPr>
+        <w:ind w:left="720" w:hanging="360"/>
+      </w:pPr>
+    </w:lvl>
+    <w:lvl w:ilvl="1">
+      <w:start w:val="1"/>
+      <w:numFmt w:val="bullet"/>
+      <w:lvlText w:val="•"/>
+      <w:lvlJc w:val="left"/>
+      <w:pPr>
+        <w:ind w:left="1440" w:hanging="360"/>
+      </w:pPr>
+    </w:lvl>
+    <w:lvl w:ilvl="2">
+      <w:start w:val="1"/>
+      <w:numFmt w:val="bullet"/>
+      <w:lvlText w:val="•"/>
+      <w:lvlJc w:val="left"/>
+      <w:pPr>
+        <w:ind w:left="2160" w:hanging="360"/>
+      </w:pPr>
+    </w:lvl>
+    <w:lvl w:ilvl="3">
+      <w:start w:val="1"/>
+      <w:numFmt w:val="bullet"/>
+      <w:lvlText w:val="•"/>
+      <w:lvlJc w:val="left"/>
+      <w:pPr>
+        <w:ind w:left="2880" w:hanging="360"/>
+      </w:pPr>
+    </w:lvl>
+    <w:lvl w:ilvl="4">
+      <w:start w:val="1"/>
+      <w:numFmt w:val="bullet"/>
+      <w:lvlText w:val="•"/>
+      <w:lvlJc w:val="left"/>
+      <w:pPr>
+        <w:ind w:left="3600" w:hanging="360"/>
+      </w:pPr>
+    </w:lvl>
+    <w:lvl w:ilvl="5">
+      <w:start w:val="1"/>
+      <w:numFmt w:val="bullet"/>
+      <w:lvlText w:val="•"/>
+      <w:lvlJc w:val="left"/>
+      <w:pPr>
+        <w:ind w:left="4320" w:hanging="360"/>
+      </w:pPr>
+    </w:lvl>
+    <w:lvl w:ilvl="6">
+      <w:start w:val="1"/>
+      <w:numFmt w:val="bullet"/>
+      <w:lvlText w:val="•"/>
+      <w:lvlJc w:val="left"/>
+      <w:pPr>
+        <w:ind w:left="5040" w:hanging="360"/>
+      </w:pPr>
+    </w:lvl>
+    <w:lvl w:ilvl="7">
+      <w:start w:val="1"/>
+      <w:numFmt w:val="bullet"/>
+      <w:lvlText w:val="•"/>
+      <w:lvlJc w:val="left"/>
+      <w:pPr>
+        <w:ind w:left="5760" w:hanging="360"/>
+      </w:pPr>
+    </w:lvl>
+    <w:lvl w:ilvl="8">
+      <w:start w:val="1"/>
+      <w:numFmt w:val="bullet"/>
+      <w:lvlText w:val="•"/>
+      <w:lvlJc w:val="left"/>
+      <w:pPr>
+        <w:ind w:left="6480" w:hanging="360"/>
+      </w:pPr>
+    </w:lvl>
+  </w:abstractNum>
+  <w:abstractNum w:abstractNumId="2">
+    <w:multiLevelType w:val="hybridMultilevel"/>
+    <w:lvl w:ilvl="0">
+      <w:start w:val="1"/>
+      <w:numFmt w:val="decimal"/>
+      <w:lvlText w:val="%1."/>
+      <w:lvlJc w:val="left"/>
+      <w:pPr>
+        <w:ind w:left="720" w:hanging="360"/>
+      </w:pPr>
+    </w:lvl>
+    <w:lvl w:ilvl="1">
+      <w:start w:val="1"/>
+      <w:numFmt w:val="decimal"/>
+      <w:lvlText w:val="%1."/>
+      <w:lvlJc w:val="left"/>
+      <w:pPr>
+        <w:ind w:left="1440" w:hanging="360"/>
+      </w:pPr>
+    </w:lvl>
+    <w:lvl w:ilvl="2">
+      <w:start w:val="1"/>
+      <w:numFmt w:val="decimal"/>
+      <w:lvlText w:val="%1."/>
+      <w:lvlJc w:val="left"/>
+      <w:pPr>
+        <w:ind w:left="2160" w:hanging="360"/>
+      </w:pPr>
+    </w:lvl>
+    <w:lvl w:ilvl="3">
+      <w:start w:val="1"/>
+      <w:numFmt w:val="decimal"/>
+      <w:lvlText w:val="%1."/>
+      <w:lvlJc w:val="left"/>
+      <w:pPr>
+        <w:ind w:left="2880" w:hanging="360"/>
+      </w:pPr>
+    </w:lvl>
+    <w:lvl w:ilvl="4">
+      <w:start w:val="1"/>
+      <w:numFmt w:val="decimal"/>
+      <w:lvlText w:val="%1."/>
+      <w:lvlJc w:val="left"/>
+      <w:pPr>
+        <w:ind w:left="3600" w:hanging="360"/>
+      </w:pPr>
+    </w:lvl>
+    <w:lvl w:ilvl="5">
+      <w:start w:val="1"/>
+      <w:numFmt w:val="decimal"/>
+      <w:lvlText w:val="%1."/>
+      <w:lvlJc w:val="left"/>
+      <w:pPr>
+        <w:ind w:left="4320" w:hanging="360"/>
+      </w:pPr>
+    </w:lvl>
+    <w:lvl w:ilvl="6">
+      <w:start w:val="1"/>
+      <w:numFmt w:val="decimal"/>
+      <w:lvlText w:val="%1."/>
+      <w:lvlJc w:val="left"/>
+      <w:pPr>
+        <w:ind w:left="5040" w:hanging="360"/>
+      </w:pPr>
+    </w:lvl>
+    <w:lvl w:ilvl="7">
+      <w:start w:val="1"/>
+      <w:numFmt w:val="decimal"/>
+      <w:lvlText w:val="%1."/>
+      <w:lvlJc w:val="left"/>
+      <w:pPr>
+        <w:ind w:left="5760" w:hanging="360"/>
+      </w:pPr>
+    </w:lvl>
+    <w:lvl w:ilvl="8">
+      <w:start w:val="1"/>
+      <w:numFmt w:val="decimal"/>
+      <w:lvlText w:val="%1."/>
+      <w:lvlJc w:val="left"/>
+      <w:pPr>
+        <w:ind w:left="6480" w:hanging="360"/>
+      </w:pPr>
+    </w:lvl>
+  </w:abstractNum>
+  <w:abstractNum w:abstractNumId="3">
+    <w:multiLevelType w:val="hybridMultilevel"/>
+    <w:lvl w:ilvl="0">
+      <w:start w:val="1"/>
+      <w:numFmt w:val="decimal"/>
+      <w:lvlText w:val="%1."/>
+      <w:lvlJc w:val="left"/>
+      <w:pPr>
+        <w:ind w:left="720" w:hanging="360"/>
+      </w:pPr>
+    </w:lvl>
+    <w:lvl w:ilvl="1">
+      <w:start w:val="1"/>
+      <w:numFmt w:val="decimal"/>
+      <w:lvlText w:val="%1."/>
+      <w:lvlJc w:val="left"/>
+      <w:pPr>
+        <w:ind w:left="1440" w:hanging="360"/>
+      </w:pPr>
+    </w:lvl>
+    <w:lvl w:ilvl="2">
+      <w:start w:val="1"/>
+      <w:numFmt w:val="decimal"/>
+      <w:lvlText w:val="%1."/>
+      <w:lvlJc w:val="left"/>
+      <w:pPr>
+        <w:ind w:left="2160" w:hanging="360"/>
+      </w:pPr>
+    </w:lvl>
+    <w:lvl w:ilvl="3">
+      <w:start w:val="1"/>
+      <w:numFmt w:val="decimal"/>
+      <w:lvlText w:val="%1."/>
+      <w:lvlJc w:val="left"/>
+      <w:pPr>
+        <w:ind w:left="2880" w:hanging="360"/>
+      </w:pPr>
+    </w:lvl>
+    <w:lvl w:ilvl="4">
+      <w:start w:val="1"/>
+      <w:numFmt w:val="decimal"/>
+      <w:lvlText w:val="%1."/>
+      <w:lvlJc w:val="left"/>
+      <w:pPr>
+        <w:ind w:left="3600" w:hanging="360"/>
+      </w:pPr>
+    </w:lvl>
+    <w:lvl w:ilvl="5">
+      <w:start w:val="1"/>
+      <w:numFmt w:val="decimal"/>
+      <w:lvlText w:val="%1."/>
+      <w:lvlJc w:val="left"/>
+      <w:pPr>
+        <w:ind w:left="4320" w:hanging="360"/>
+      </w:pPr>
+    </w:lvl>
+    <w:lvl w:ilvl="6">
+      <w:start w:val="1"/>
+      <w:numFmt w:val="decimal"/>
+      <w:lvlText w:val="%1."/>
+      <w:lvlJc w:val="left"/>
+      <w:pPr>
+        <w:ind w:left="5040" w:hanging="360"/>
+      </w:pPr>
+    </w:lvl>
+    <w:lvl w:ilvl="7">
+      <w:start w:val="1"/>
+      <w:numFmt w:val="decimal"/>
+      <w:lvlText w:val="%1."/>
+      <w:lvlJc w:val="left"/>
+      <w:pPr>
+        <w:ind w:left="5760" w:hanging="360"/>
+      </w:pPr>
+    </w:lvl>
+    <w:lvl w:ilvl="8">
+      <w:start w:val="1"/>
+      <w:numFmt w:val="decimal"/>
+      <w:lvlText w:val="%1."/>
+      <w:lvlJc w:val="left"/>
+      <w:pPr>
+        <w:ind w:left="6480" w:hanging="360"/>
+      </w:pPr>
+    </w:lvl>
+  </w:abstractNum>
+  <w:num w:numId="1">
+    <w:abstractNumId w:val="1"/>
+  </w:num>
+  <w:num w:numId="2">
+    <w:abstractNumId w:val="2"/>
+  </w:num>
+  <w:num w:numId="3">
+    <w:abstractNumId w:val="3"/>
+  </w:num>
+</w:numbering>
 </file>
 
 <file path=word/styles.xml><?xml version="1.0" encoding="utf-8"?>

</xml_diff>

<commit_message>
fix: per-level bullet chars (•/◦/▪) and honour text_template in writer
- _make_numbering_def now cycles •/◦/▪ (U+2022/25E6/25AA) across bullet
  list levels, matching Word's standard multi-level bullet appearance
- numbering_writer now uses lvl.text_template when it differs from the
  generic "%1." default, enabling explicit bullet chars to round-trip
  correctly through the writer

Co-Authored-By: Claude Sonnet 4.6 <noreply@anthropic.com>
</commit_message>
<xml_diff>
--- a/tests/fixtures/generic_showcase.docx
+++ b/tests/fixtures/generic_showcase.docx
@@ -1011,70 +1011,70 @@
     <w:lvl w:ilvl="1">
       <w:start w:val="1"/>
       <w:numFmt w:val="bullet"/>
-      <w:lvlText w:val="•"/>
+      <w:lvlText w:val="◦"/>
       <w:lvlJc w:val="left"/>
       <w:pPr>
         <w:ind w:left="1440" w:hanging="360"/>
       </w:pPr>
     </w:lvl>
     <w:lvl w:ilvl="2">
+      <w:start w:val="1"/>
+      <w:numFmt w:val="bullet"/>
+      <w:lvlText w:val="▪"/>
+      <w:lvlJc w:val="left"/>
+      <w:pPr>
+        <w:ind w:left="2160" w:hanging="360"/>
+      </w:pPr>
+    </w:lvl>
+    <w:lvl w:ilvl="3">
       <w:start w:val="1"/>
       <w:numFmt w:val="bullet"/>
       <w:lvlText w:val="•"/>
       <w:lvlJc w:val="left"/>
       <w:pPr>
-        <w:ind w:left="2160" w:hanging="360"/>
-      </w:pPr>
-    </w:lvl>
-    <w:lvl w:ilvl="3">
+        <w:ind w:left="2880" w:hanging="360"/>
+      </w:pPr>
+    </w:lvl>
+    <w:lvl w:ilvl="4">
+      <w:start w:val="1"/>
+      <w:numFmt w:val="bullet"/>
+      <w:lvlText w:val="◦"/>
+      <w:lvlJc w:val="left"/>
+      <w:pPr>
+        <w:ind w:left="3600" w:hanging="360"/>
+      </w:pPr>
+    </w:lvl>
+    <w:lvl w:ilvl="5">
+      <w:start w:val="1"/>
+      <w:numFmt w:val="bullet"/>
+      <w:lvlText w:val="▪"/>
+      <w:lvlJc w:val="left"/>
+      <w:pPr>
+        <w:ind w:left="4320" w:hanging="360"/>
+      </w:pPr>
+    </w:lvl>
+    <w:lvl w:ilvl="6">
       <w:start w:val="1"/>
       <w:numFmt w:val="bullet"/>
       <w:lvlText w:val="•"/>
       <w:lvlJc w:val="left"/>
       <w:pPr>
-        <w:ind w:left="2880" w:hanging="360"/>
-      </w:pPr>
-    </w:lvl>
-    <w:lvl w:ilvl="4">
+        <w:ind w:left="5040" w:hanging="360"/>
+      </w:pPr>
+    </w:lvl>
+    <w:lvl w:ilvl="7">
       <w:start w:val="1"/>
       <w:numFmt w:val="bullet"/>
-      <w:lvlText w:val="•"/>
-      <w:lvlJc w:val="left"/>
-      <w:pPr>
-        <w:ind w:left="3600" w:hanging="360"/>
-      </w:pPr>
-    </w:lvl>
-    <w:lvl w:ilvl="5">
+      <w:lvlText w:val="◦"/>
+      <w:lvlJc w:val="left"/>
+      <w:pPr>
+        <w:ind w:left="5760" w:hanging="360"/>
+      </w:pPr>
+    </w:lvl>
+    <w:lvl w:ilvl="8">
       <w:start w:val="1"/>
       <w:numFmt w:val="bullet"/>
-      <w:lvlText w:val="•"/>
-      <w:lvlJc w:val="left"/>
-      <w:pPr>
-        <w:ind w:left="4320" w:hanging="360"/>
-      </w:pPr>
-    </w:lvl>
-    <w:lvl w:ilvl="6">
-      <w:start w:val="1"/>
-      <w:numFmt w:val="bullet"/>
-      <w:lvlText w:val="•"/>
-      <w:lvlJc w:val="left"/>
-      <w:pPr>
-        <w:ind w:left="5040" w:hanging="360"/>
-      </w:pPr>
-    </w:lvl>
-    <w:lvl w:ilvl="7">
-      <w:start w:val="1"/>
-      <w:numFmt w:val="bullet"/>
-      <w:lvlText w:val="•"/>
-      <w:lvlJc w:val="left"/>
-      <w:pPr>
-        <w:ind w:left="5760" w:hanging="360"/>
-      </w:pPr>
-    </w:lvl>
-    <w:lvl w:ilvl="8">
-      <w:start w:val="1"/>
-      <w:numFmt w:val="bullet"/>
-      <w:lvlText w:val="•"/>
+      <w:lvlText w:val="▪"/>
       <w:lvlJc w:val="left"/>
       <w:pPr>
         <w:ind w:left="6480" w:hanging="360"/>

</xml_diff>

<commit_message>
fix: correct list numbering — per-list defs, level-aware templates, CSS/attr format
- Each <ul>/<ol> element gets its own NumberingDefinition so nested counters
  restart independently and mixed nesting (ul inside ol) preserves the correct
  format at every level
- Decimal lvlText now uses %{level+1}. so sub-items show their own counter
  instead of the parent's (was showing "3.1." now shows "1.")
- _make_numbering_def reads list-style-type CSS and <ol type> attribute to
  set lowerLetter/upperLetter/lowerRoman/upperRoman correctly
- Updated two tests to reflect the new per-list-def model; added 9 new tests
  covering decimal sub-item counters, mixed nesting format, and CSS/attr overrides
- Docs: open-api.md and tutorial.md updated with bullet cycling and format notes

Co-Authored-By: Claude Sonnet 4.6 <noreply@anthropic.com>
</commit_message>
<xml_diff>
--- a/tests/fixtures/generic_showcase.docx
+++ b/tests/fixtures/generic_showcase.docx
@@ -323,7 +323,7 @@
       <w:pPr>
         <w:numPr>
           <w:ilvl w:val="1"/>
-          <w:numId w:val="1"/>
+          <w:numId w:val="2"/>
         </w:numPr>
       </w:pPr>
       <w:r>
@@ -334,7 +334,7 @@
       <w:pPr>
         <w:numPr>
           <w:ilvl w:val="1"/>
-          <w:numId w:val="1"/>
+          <w:numId w:val="2"/>
         </w:numPr>
       </w:pPr>
       <w:r>
@@ -348,7 +348,7 @@
       <w:pPr>
         <w:numPr>
           <w:ilvl w:val="2"/>
-          <w:numId w:val="1"/>
+          <w:numId w:val="3"/>
         </w:numPr>
       </w:pPr>
       <w:r>
@@ -376,7 +376,7 @@
       <w:pPr>
         <w:numPr>
           <w:ilvl w:val="0"/>
-          <w:numId w:val="2"/>
+          <w:numId w:val="4"/>
         </w:numPr>
       </w:pPr>
       <w:r>
@@ -387,7 +387,7 @@
       <w:pPr>
         <w:numPr>
           <w:ilvl w:val="0"/>
-          <w:numId w:val="2"/>
+          <w:numId w:val="4"/>
         </w:numPr>
       </w:pPr>
       <w:r>
@@ -403,7 +403,7 @@
       <w:pPr>
         <w:numPr>
           <w:ilvl w:val="0"/>
-          <w:numId w:val="2"/>
+          <w:numId w:val="4"/>
         </w:numPr>
       </w:pPr>
       <w:r>
@@ -417,7 +417,7 @@
       <w:pPr>
         <w:numPr>
           <w:ilvl w:val="1"/>
-          <w:numId w:val="2"/>
+          <w:numId w:val="5"/>
         </w:numPr>
       </w:pPr>
       <w:r>
@@ -428,7 +428,7 @@
       <w:pPr>
         <w:numPr>
           <w:ilvl w:val="1"/>
-          <w:numId w:val="2"/>
+          <w:numId w:val="5"/>
         </w:numPr>
       </w:pPr>
       <w:r>
@@ -445,7 +445,7 @@
       <w:pPr>
         <w:numPr>
           <w:ilvl w:val="0"/>
-          <w:numId w:val="3"/>
+          <w:numId w:val="6"/>
         </w:numPr>
       </w:pPr>
       <w:r>
@@ -459,7 +459,7 @@
       <w:pPr>
         <w:numPr>
           <w:ilvl w:val="1"/>
-          <w:numId w:val="3"/>
+          <w:numId w:val="7"/>
         </w:numPr>
       </w:pPr>
       <w:r>
@@ -1085,8 +1085,8 @@
     <w:multiLevelType w:val="hybridMultilevel"/>
     <w:lvl w:ilvl="0">
       <w:start w:val="1"/>
-      <w:numFmt w:val="decimal"/>
-      <w:lvlText w:val="%1."/>
+      <w:numFmt w:val="bullet"/>
+      <w:lvlText w:val="•"/>
       <w:lvlJc w:val="left"/>
       <w:pPr>
         <w:ind w:left="720" w:hanging="360"/>
@@ -1094,8 +1094,8 @@
     </w:lvl>
     <w:lvl w:ilvl="1">
       <w:start w:val="1"/>
-      <w:numFmt w:val="decimal"/>
-      <w:lvlText w:val="%1."/>
+      <w:numFmt w:val="bullet"/>
+      <w:lvlText w:val="◦"/>
       <w:lvlJc w:val="left"/>
       <w:pPr>
         <w:ind w:left="1440" w:hanging="360"/>
@@ -1103,8 +1103,8 @@
     </w:lvl>
     <w:lvl w:ilvl="2">
       <w:start w:val="1"/>
-      <w:numFmt w:val="decimal"/>
-      <w:lvlText w:val="%1."/>
+      <w:numFmt w:val="bullet"/>
+      <w:lvlText w:val="▪"/>
       <w:lvlJc w:val="left"/>
       <w:pPr>
         <w:ind w:left="2160" w:hanging="360"/>
@@ -1112,8 +1112,8 @@
     </w:lvl>
     <w:lvl w:ilvl="3">
       <w:start w:val="1"/>
-      <w:numFmt w:val="decimal"/>
-      <w:lvlText w:val="%1."/>
+      <w:numFmt w:val="bullet"/>
+      <w:lvlText w:val="•"/>
       <w:lvlJc w:val="left"/>
       <w:pPr>
         <w:ind w:left="2880" w:hanging="360"/>
@@ -1121,8 +1121,8 @@
     </w:lvl>
     <w:lvl w:ilvl="4">
       <w:start w:val="1"/>
-      <w:numFmt w:val="decimal"/>
-      <w:lvlText w:val="%1."/>
+      <w:numFmt w:val="bullet"/>
+      <w:lvlText w:val="◦"/>
       <w:lvlJc w:val="left"/>
       <w:pPr>
         <w:ind w:left="3600" w:hanging="360"/>
@@ -1130,8 +1130,8 @@
     </w:lvl>
     <w:lvl w:ilvl="5">
       <w:start w:val="1"/>
-      <w:numFmt w:val="decimal"/>
-      <w:lvlText w:val="%1."/>
+      <w:numFmt w:val="bullet"/>
+      <w:lvlText w:val="▪"/>
       <w:lvlJc w:val="left"/>
       <w:pPr>
         <w:ind w:left="4320" w:hanging="360"/>
@@ -1139,8 +1139,8 @@
     </w:lvl>
     <w:lvl w:ilvl="6">
       <w:start w:val="1"/>
-      <w:numFmt w:val="decimal"/>
-      <w:lvlText w:val="%1."/>
+      <w:numFmt w:val="bullet"/>
+      <w:lvlText w:val="•"/>
       <w:lvlJc w:val="left"/>
       <w:pPr>
         <w:ind w:left="5040" w:hanging="360"/>
@@ -1148,8 +1148,8 @@
     </w:lvl>
     <w:lvl w:ilvl="7">
       <w:start w:val="1"/>
-      <w:numFmt w:val="decimal"/>
-      <w:lvlText w:val="%1."/>
+      <w:numFmt w:val="bullet"/>
+      <w:lvlText w:val="◦"/>
       <w:lvlJc w:val="left"/>
       <w:pPr>
         <w:ind w:left="5760" w:hanging="360"/>
@@ -1157,8 +1157,8 @@
     </w:lvl>
     <w:lvl w:ilvl="8">
       <w:start w:val="1"/>
-      <w:numFmt w:val="decimal"/>
-      <w:lvlText w:val="%1."/>
+      <w:numFmt w:val="bullet"/>
+      <w:lvlText w:val="▪"/>
       <w:lvlJc w:val="left"/>
       <w:pPr>
         <w:ind w:left="6480" w:hanging="360"/>
@@ -1169,6 +1169,90 @@
     <w:multiLevelType w:val="hybridMultilevel"/>
     <w:lvl w:ilvl="0">
       <w:start w:val="1"/>
+      <w:numFmt w:val="bullet"/>
+      <w:lvlText w:val="•"/>
+      <w:lvlJc w:val="left"/>
+      <w:pPr>
+        <w:ind w:left="720" w:hanging="360"/>
+      </w:pPr>
+    </w:lvl>
+    <w:lvl w:ilvl="1">
+      <w:start w:val="1"/>
+      <w:numFmt w:val="bullet"/>
+      <w:lvlText w:val="◦"/>
+      <w:lvlJc w:val="left"/>
+      <w:pPr>
+        <w:ind w:left="1440" w:hanging="360"/>
+      </w:pPr>
+    </w:lvl>
+    <w:lvl w:ilvl="2">
+      <w:start w:val="1"/>
+      <w:numFmt w:val="bullet"/>
+      <w:lvlText w:val="▪"/>
+      <w:lvlJc w:val="left"/>
+      <w:pPr>
+        <w:ind w:left="2160" w:hanging="360"/>
+      </w:pPr>
+    </w:lvl>
+    <w:lvl w:ilvl="3">
+      <w:start w:val="1"/>
+      <w:numFmt w:val="bullet"/>
+      <w:lvlText w:val="•"/>
+      <w:lvlJc w:val="left"/>
+      <w:pPr>
+        <w:ind w:left="2880" w:hanging="360"/>
+      </w:pPr>
+    </w:lvl>
+    <w:lvl w:ilvl="4">
+      <w:start w:val="1"/>
+      <w:numFmt w:val="bullet"/>
+      <w:lvlText w:val="◦"/>
+      <w:lvlJc w:val="left"/>
+      <w:pPr>
+        <w:ind w:left="3600" w:hanging="360"/>
+      </w:pPr>
+    </w:lvl>
+    <w:lvl w:ilvl="5">
+      <w:start w:val="1"/>
+      <w:numFmt w:val="bullet"/>
+      <w:lvlText w:val="▪"/>
+      <w:lvlJc w:val="left"/>
+      <w:pPr>
+        <w:ind w:left="4320" w:hanging="360"/>
+      </w:pPr>
+    </w:lvl>
+    <w:lvl w:ilvl="6">
+      <w:start w:val="1"/>
+      <w:numFmt w:val="bullet"/>
+      <w:lvlText w:val="•"/>
+      <w:lvlJc w:val="left"/>
+      <w:pPr>
+        <w:ind w:left="5040" w:hanging="360"/>
+      </w:pPr>
+    </w:lvl>
+    <w:lvl w:ilvl="7">
+      <w:start w:val="1"/>
+      <w:numFmt w:val="bullet"/>
+      <w:lvlText w:val="◦"/>
+      <w:lvlJc w:val="left"/>
+      <w:pPr>
+        <w:ind w:left="5760" w:hanging="360"/>
+      </w:pPr>
+    </w:lvl>
+    <w:lvl w:ilvl="8">
+      <w:start w:val="1"/>
+      <w:numFmt w:val="bullet"/>
+      <w:lvlText w:val="▪"/>
+      <w:lvlJc w:val="left"/>
+      <w:pPr>
+        <w:ind w:left="6480" w:hanging="360"/>
+      </w:pPr>
+    </w:lvl>
+  </w:abstractNum>
+  <w:abstractNum w:abstractNumId="4">
+    <w:multiLevelType w:val="hybridMultilevel"/>
+    <w:lvl w:ilvl="0">
+      <w:start w:val="1"/>
       <w:numFmt w:val="decimal"/>
       <w:lvlText w:val="%1."/>
       <w:lvlJc w:val="left"/>
@@ -1179,25 +1263,193 @@
     <w:lvl w:ilvl="1">
       <w:start w:val="1"/>
       <w:numFmt w:val="decimal"/>
+      <w:lvlText w:val="%2."/>
+      <w:lvlJc w:val="left"/>
+      <w:pPr>
+        <w:ind w:left="1440" w:hanging="360"/>
+      </w:pPr>
+    </w:lvl>
+    <w:lvl w:ilvl="2">
+      <w:start w:val="1"/>
+      <w:numFmt w:val="decimal"/>
+      <w:lvlText w:val="%3."/>
+      <w:lvlJc w:val="left"/>
+      <w:pPr>
+        <w:ind w:left="2160" w:hanging="360"/>
+      </w:pPr>
+    </w:lvl>
+    <w:lvl w:ilvl="3">
+      <w:start w:val="1"/>
+      <w:numFmt w:val="decimal"/>
+      <w:lvlText w:val="%4."/>
+      <w:lvlJc w:val="left"/>
+      <w:pPr>
+        <w:ind w:left="2880" w:hanging="360"/>
+      </w:pPr>
+    </w:lvl>
+    <w:lvl w:ilvl="4">
+      <w:start w:val="1"/>
+      <w:numFmt w:val="decimal"/>
+      <w:lvlText w:val="%5."/>
+      <w:lvlJc w:val="left"/>
+      <w:pPr>
+        <w:ind w:left="3600" w:hanging="360"/>
+      </w:pPr>
+    </w:lvl>
+    <w:lvl w:ilvl="5">
+      <w:start w:val="1"/>
+      <w:numFmt w:val="decimal"/>
+      <w:lvlText w:val="%6."/>
+      <w:lvlJc w:val="left"/>
+      <w:pPr>
+        <w:ind w:left="4320" w:hanging="360"/>
+      </w:pPr>
+    </w:lvl>
+    <w:lvl w:ilvl="6">
+      <w:start w:val="1"/>
+      <w:numFmt w:val="decimal"/>
+      <w:lvlText w:val="%7."/>
+      <w:lvlJc w:val="left"/>
+      <w:pPr>
+        <w:ind w:left="5040" w:hanging="360"/>
+      </w:pPr>
+    </w:lvl>
+    <w:lvl w:ilvl="7">
+      <w:start w:val="1"/>
+      <w:numFmt w:val="decimal"/>
+      <w:lvlText w:val="%8."/>
+      <w:lvlJc w:val="left"/>
+      <w:pPr>
+        <w:ind w:left="5760" w:hanging="360"/>
+      </w:pPr>
+    </w:lvl>
+    <w:lvl w:ilvl="8">
+      <w:start w:val="1"/>
+      <w:numFmt w:val="decimal"/>
+      <w:lvlText w:val="%9."/>
+      <w:lvlJc w:val="left"/>
+      <w:pPr>
+        <w:ind w:left="6480" w:hanging="360"/>
+      </w:pPr>
+    </w:lvl>
+  </w:abstractNum>
+  <w:abstractNum w:abstractNumId="5">
+    <w:multiLevelType w:val="hybridMultilevel"/>
+    <w:lvl w:ilvl="0">
+      <w:start w:val="1"/>
+      <w:numFmt w:val="decimal"/>
       <w:lvlText w:val="%1."/>
       <w:lvlJc w:val="left"/>
       <w:pPr>
+        <w:ind w:left="720" w:hanging="360"/>
+      </w:pPr>
+    </w:lvl>
+    <w:lvl w:ilvl="1">
+      <w:start w:val="1"/>
+      <w:numFmt w:val="decimal"/>
+      <w:lvlText w:val="%2."/>
+      <w:lvlJc w:val="left"/>
+      <w:pPr>
         <w:ind w:left="1440" w:hanging="360"/>
       </w:pPr>
     </w:lvl>
     <w:lvl w:ilvl="2">
       <w:start w:val="1"/>
       <w:numFmt w:val="decimal"/>
+      <w:lvlText w:val="%3."/>
+      <w:lvlJc w:val="left"/>
+      <w:pPr>
+        <w:ind w:left="2160" w:hanging="360"/>
+      </w:pPr>
+    </w:lvl>
+    <w:lvl w:ilvl="3">
+      <w:start w:val="1"/>
+      <w:numFmt w:val="decimal"/>
+      <w:lvlText w:val="%4."/>
+      <w:lvlJc w:val="left"/>
+      <w:pPr>
+        <w:ind w:left="2880" w:hanging="360"/>
+      </w:pPr>
+    </w:lvl>
+    <w:lvl w:ilvl="4">
+      <w:start w:val="1"/>
+      <w:numFmt w:val="decimal"/>
+      <w:lvlText w:val="%5."/>
+      <w:lvlJc w:val="left"/>
+      <w:pPr>
+        <w:ind w:left="3600" w:hanging="360"/>
+      </w:pPr>
+    </w:lvl>
+    <w:lvl w:ilvl="5">
+      <w:start w:val="1"/>
+      <w:numFmt w:val="decimal"/>
+      <w:lvlText w:val="%6."/>
+      <w:lvlJc w:val="left"/>
+      <w:pPr>
+        <w:ind w:left="4320" w:hanging="360"/>
+      </w:pPr>
+    </w:lvl>
+    <w:lvl w:ilvl="6">
+      <w:start w:val="1"/>
+      <w:numFmt w:val="decimal"/>
+      <w:lvlText w:val="%7."/>
+      <w:lvlJc w:val="left"/>
+      <w:pPr>
+        <w:ind w:left="5040" w:hanging="360"/>
+      </w:pPr>
+    </w:lvl>
+    <w:lvl w:ilvl="7">
+      <w:start w:val="1"/>
+      <w:numFmt w:val="decimal"/>
+      <w:lvlText w:val="%8."/>
+      <w:lvlJc w:val="left"/>
+      <w:pPr>
+        <w:ind w:left="5760" w:hanging="360"/>
+      </w:pPr>
+    </w:lvl>
+    <w:lvl w:ilvl="8">
+      <w:start w:val="1"/>
+      <w:numFmt w:val="decimal"/>
+      <w:lvlText w:val="%9."/>
+      <w:lvlJc w:val="left"/>
+      <w:pPr>
+        <w:ind w:left="6480" w:hanging="360"/>
+      </w:pPr>
+    </w:lvl>
+  </w:abstractNum>
+  <w:abstractNum w:abstractNumId="6">
+    <w:multiLevelType w:val="hybridMultilevel"/>
+    <w:lvl w:ilvl="0">
+      <w:start w:val="1"/>
+      <w:numFmt w:val="decimal"/>
       <w:lvlText w:val="%1."/>
       <w:lvlJc w:val="left"/>
       <w:pPr>
+        <w:ind w:left="720" w:hanging="360"/>
+      </w:pPr>
+    </w:lvl>
+    <w:lvl w:ilvl="1">
+      <w:start w:val="1"/>
+      <w:numFmt w:val="decimal"/>
+      <w:lvlText w:val="%2."/>
+      <w:lvlJc w:val="left"/>
+      <w:pPr>
+        <w:ind w:left="1440" w:hanging="360"/>
+      </w:pPr>
+    </w:lvl>
+    <w:lvl w:ilvl="2">
+      <w:start w:val="1"/>
+      <w:numFmt w:val="decimal"/>
+      <w:lvlText w:val="%3."/>
+      <w:lvlJc w:val="left"/>
+      <w:pPr>
         <w:ind w:left="2160" w:hanging="360"/>
       </w:pPr>
     </w:lvl>
     <w:lvl w:ilvl="3">
       <w:start w:val="1"/>
       <w:numFmt w:val="decimal"/>
-      <w:lvlText w:val="%1."/>
+      <w:lvlText w:val="%4."/>
       <w:lvlJc w:val="left"/>
       <w:pPr>
         <w:ind w:left="2880" w:hanging="360"/>
@@ -1206,7 +1458,7 @@
     <w:lvl w:ilvl="4">
       <w:start w:val="1"/>
       <w:numFmt w:val="decimal"/>
-      <w:lvlText w:val="%1."/>
+      <w:lvlText w:val="%5."/>
       <w:lvlJc w:val="left"/>
       <w:pPr>
         <w:ind w:left="3600" w:hanging="360"/>
@@ -1215,7 +1467,7 @@
     <w:lvl w:ilvl="5">
       <w:start w:val="1"/>
       <w:numFmt w:val="decimal"/>
-      <w:lvlText w:val="%1."/>
+      <w:lvlText w:val="%6."/>
       <w:lvlJc w:val="left"/>
       <w:pPr>
         <w:ind w:left="4320" w:hanging="360"/>
@@ -1224,7 +1476,7 @@
     <w:lvl w:ilvl="6">
       <w:start w:val="1"/>
       <w:numFmt w:val="decimal"/>
-      <w:lvlText w:val="%1."/>
+      <w:lvlText w:val="%7."/>
       <w:lvlJc w:val="left"/>
       <w:pPr>
         <w:ind w:left="5040" w:hanging="360"/>
@@ -1233,7 +1485,7 @@
     <w:lvl w:ilvl="7">
       <w:start w:val="1"/>
       <w:numFmt w:val="decimal"/>
-      <w:lvlText w:val="%1."/>
+      <w:lvlText w:val="%8."/>
       <w:lvlJc w:val="left"/>
       <w:pPr>
         <w:ind w:left="5760" w:hanging="360"/>
@@ -1242,7 +1494,91 @@
     <w:lvl w:ilvl="8">
       <w:start w:val="1"/>
       <w:numFmt w:val="decimal"/>
-      <w:lvlText w:val="%1."/>
+      <w:lvlText w:val="%9."/>
+      <w:lvlJc w:val="left"/>
+      <w:pPr>
+        <w:ind w:left="6480" w:hanging="360"/>
+      </w:pPr>
+    </w:lvl>
+  </w:abstractNum>
+  <w:abstractNum w:abstractNumId="7">
+    <w:multiLevelType w:val="hybridMultilevel"/>
+    <w:lvl w:ilvl="0">
+      <w:start w:val="1"/>
+      <w:numFmt w:val="bullet"/>
+      <w:lvlText w:val="•"/>
+      <w:lvlJc w:val="left"/>
+      <w:pPr>
+        <w:ind w:left="720" w:hanging="360"/>
+      </w:pPr>
+    </w:lvl>
+    <w:lvl w:ilvl="1">
+      <w:start w:val="1"/>
+      <w:numFmt w:val="bullet"/>
+      <w:lvlText w:val="◦"/>
+      <w:lvlJc w:val="left"/>
+      <w:pPr>
+        <w:ind w:left="1440" w:hanging="360"/>
+      </w:pPr>
+    </w:lvl>
+    <w:lvl w:ilvl="2">
+      <w:start w:val="1"/>
+      <w:numFmt w:val="bullet"/>
+      <w:lvlText w:val="▪"/>
+      <w:lvlJc w:val="left"/>
+      <w:pPr>
+        <w:ind w:left="2160" w:hanging="360"/>
+      </w:pPr>
+    </w:lvl>
+    <w:lvl w:ilvl="3">
+      <w:start w:val="1"/>
+      <w:numFmt w:val="bullet"/>
+      <w:lvlText w:val="•"/>
+      <w:lvlJc w:val="left"/>
+      <w:pPr>
+        <w:ind w:left="2880" w:hanging="360"/>
+      </w:pPr>
+    </w:lvl>
+    <w:lvl w:ilvl="4">
+      <w:start w:val="1"/>
+      <w:numFmt w:val="bullet"/>
+      <w:lvlText w:val="◦"/>
+      <w:lvlJc w:val="left"/>
+      <w:pPr>
+        <w:ind w:left="3600" w:hanging="360"/>
+      </w:pPr>
+    </w:lvl>
+    <w:lvl w:ilvl="5">
+      <w:start w:val="1"/>
+      <w:numFmt w:val="bullet"/>
+      <w:lvlText w:val="▪"/>
+      <w:lvlJc w:val="left"/>
+      <w:pPr>
+        <w:ind w:left="4320" w:hanging="360"/>
+      </w:pPr>
+    </w:lvl>
+    <w:lvl w:ilvl="6">
+      <w:start w:val="1"/>
+      <w:numFmt w:val="bullet"/>
+      <w:lvlText w:val="•"/>
+      <w:lvlJc w:val="left"/>
+      <w:pPr>
+        <w:ind w:left="5040" w:hanging="360"/>
+      </w:pPr>
+    </w:lvl>
+    <w:lvl w:ilvl="7">
+      <w:start w:val="1"/>
+      <w:numFmt w:val="bullet"/>
+      <w:lvlText w:val="◦"/>
+      <w:lvlJc w:val="left"/>
+      <w:pPr>
+        <w:ind w:left="5760" w:hanging="360"/>
+      </w:pPr>
+    </w:lvl>
+    <w:lvl w:ilvl="8">
+      <w:start w:val="1"/>
+      <w:numFmt w:val="bullet"/>
+      <w:lvlText w:val="▪"/>
       <w:lvlJc w:val="left"/>
       <w:pPr>
         <w:ind w:left="6480" w:hanging="360"/>
@@ -1257,6 +1593,18 @@
   </w:num>
   <w:num w:numId="3">
     <w:abstractNumId w:val="3"/>
+  </w:num>
+  <w:num w:numId="4">
+    <w:abstractNumId w:val="4"/>
+  </w:num>
+  <w:num w:numId="5">
+    <w:abstractNumId w:val="5"/>
+  </w:num>
+  <w:num w:numId="6">
+    <w:abstractNumId w:val="6"/>
+  </w:num>
+  <w:num w:numId="7">
+    <w:abstractNumId w:val="7"/>
   </w:num>
 </w:numbering>
 </file>

</xml_diff>

<commit_message>
feat: generic HTML table parsing (table/tr/td/th, colspan, rowspan)
- Parses <table> elements into the existing Table/TableRow/TableCell model
- Handles thead/tbody/tfoot row groups transparently
- <th> cells are automatically bolded
- colspan → col_span; rowspan expanded via a grid algorithm into
  v_merge_start (origin row) + v_merge_continue (spanned rows) cells
- <colgroup>/<col> with CSS width → col_widths_pt in the Table model
- CSS background-color on <td>/<th> → TableCell.shading
- 33 tests covering basic structure, headers, sections, colspan, rowspan,
  cell content, colgroup, and DOCX round-trip integration
- Docs updated: README Phase 2 table, open-api.md, tutorial.md
- Showcase fixture updated with four table examples

Co-Authored-By: Claude Sonnet 4.6 <noreply@anthropic.com>
</commit_message>
<xml_diff>
--- a/tests/fixtures/generic_showcase.docx
+++ b/tests/fixtures/generic_showcase.docx
@@ -466,6 +466,418 @@
         <w:t xml:space="preserve">Unordered child</w:t>
       </w:r>
     </w:p>
+    <w:p>
+      <w:pPr>
+        <w:pStyle w:val="Heading2"/>
+      </w:pPr>
+      <w:r>
+        <w:t xml:space="preserve">Tables</w:t>
+      </w:r>
+    </w:p>
+    <w:p>
+      <w:pPr/>
+      <w:r>
+        <w:t xml:space="preserve">Basic table with thead and tbody:</w:t>
+      </w:r>
+    </w:p>
+    <w:tbl>
+      <w:tblPr>
+        <w:tblStyle w:val="TableGrid"/>
+        <w:tblBorders>
+          <w:top w:val="single" w:sz="4" w:space="0" w:color="auto"/>
+          <w:left w:val="single" w:sz="4" w:space="0" w:color="auto"/>
+          <w:bottom w:val="single" w:sz="4" w:space="0" w:color="auto"/>
+          <w:right w:val="single" w:sz="4" w:space="0" w:color="auto"/>
+          <w:insideH w:val="single" w:sz="4" w:space="0" w:color="auto"/>
+          <w:insideV w:val="single" w:sz="4" w:space="0" w:color="auto"/>
+        </w:tblBorders>
+      </w:tblPr>
+      <w:tr>
+        <w:tc>
+          <w:tcPr/>
+          <w:p>
+            <w:pPr/>
+            <w:r>
+              <w:rPr>
+                <w:b/>
+              </w:rPr>
+              <w:t xml:space="preserve">Product</w:t>
+            </w:r>
+          </w:p>
+        </w:tc>
+        <w:tc>
+          <w:tcPr/>
+          <w:p>
+            <w:pPr/>
+            <w:r>
+              <w:rPr>
+                <w:b/>
+              </w:rPr>
+              <w:t xml:space="preserve">Q1</w:t>
+            </w:r>
+          </w:p>
+        </w:tc>
+        <w:tc>
+          <w:tcPr/>
+          <w:p>
+            <w:pPr/>
+            <w:r>
+              <w:rPr>
+                <w:b/>
+              </w:rPr>
+              <w:t xml:space="preserve">Q2</w:t>
+            </w:r>
+          </w:p>
+        </w:tc>
+        <w:tc>
+          <w:tcPr/>
+          <w:p>
+            <w:pPr/>
+            <w:r>
+              <w:rPr>
+                <w:b/>
+              </w:rPr>
+              <w:t xml:space="preserve">Q3</w:t>
+            </w:r>
+          </w:p>
+        </w:tc>
+      </w:tr>
+      <w:tr>
+        <w:tc>
+          <w:tcPr/>
+          <w:p>
+            <w:pPr/>
+            <w:r>
+              <w:t xml:space="preserve">Widgets</w:t>
+            </w:r>
+          </w:p>
+        </w:tc>
+        <w:tc>
+          <w:tcPr/>
+          <w:p>
+            <w:pPr/>
+            <w:r>
+              <w:t xml:space="preserve">120</w:t>
+            </w:r>
+          </w:p>
+        </w:tc>
+        <w:tc>
+          <w:tcPr/>
+          <w:p>
+            <w:pPr/>
+            <w:r>
+              <w:t xml:space="preserve">145</w:t>
+            </w:r>
+          </w:p>
+        </w:tc>
+        <w:tc>
+          <w:tcPr/>
+          <w:p>
+            <w:pPr/>
+            <w:r>
+              <w:t xml:space="preserve">160</w:t>
+            </w:r>
+          </w:p>
+        </w:tc>
+      </w:tr>
+      <w:tr>
+        <w:tc>
+          <w:tcPr/>
+          <w:p>
+            <w:pPr/>
+            <w:r>
+              <w:t xml:space="preserve">Gadgets</w:t>
+            </w:r>
+          </w:p>
+        </w:tc>
+        <w:tc>
+          <w:tcPr/>
+          <w:p>
+            <w:pPr/>
+            <w:r>
+              <w:t xml:space="preserve">80</w:t>
+            </w:r>
+          </w:p>
+        </w:tc>
+        <w:tc>
+          <w:tcPr/>
+          <w:p>
+            <w:pPr/>
+            <w:r>
+              <w:t xml:space="preserve">95</w:t>
+            </w:r>
+          </w:p>
+        </w:tc>
+        <w:tc>
+          <w:tcPr/>
+          <w:p>
+            <w:pPr/>
+            <w:r>
+              <w:t xml:space="preserve">110</w:t>
+            </w:r>
+          </w:p>
+        </w:tc>
+      </w:tr>
+    </w:tbl>
+    <w:p>
+      <w:pPr/>
+      <w:r>
+        <w:t xml:space="preserve">colspan — wide header cell spanning two columns:</w:t>
+      </w:r>
+    </w:p>
+    <w:tbl>
+      <w:tblPr>
+        <w:tblStyle w:val="TableGrid"/>
+        <w:tblBorders>
+          <w:top w:val="single" w:sz="4" w:space="0" w:color="auto"/>
+          <w:left w:val="single" w:sz="4" w:space="0" w:color="auto"/>
+          <w:bottom w:val="single" w:sz="4" w:space="0" w:color="auto"/>
+          <w:right w:val="single" w:sz="4" w:space="0" w:color="auto"/>
+          <w:insideH w:val="single" w:sz="4" w:space="0" w:color="auto"/>
+          <w:insideV w:val="single" w:sz="4" w:space="0" w:color="auto"/>
+        </w:tblBorders>
+      </w:tblPr>
+      <w:tr>
+        <w:tc>
+          <w:tcPr>
+            <w:gridSpan w:val="2"/>
+            <w:shd w:val="clear" w:color="auto" w:fill="D9E1F2"/>
+          </w:tcPr>
+          <w:p>
+            <w:pPr>
+              <w:shd w:val="clear" w:color="auto" w:fill="D9E1F2"/>
+            </w:pPr>
+            <w:r>
+              <w:t xml:space="preserve">Merged header (colspan=2)</w:t>
+            </w:r>
+          </w:p>
+        </w:tc>
+        <w:tc>
+          <w:tcPr/>
+          <w:p>
+            <w:pPr/>
+            <w:r>
+              <w:t xml:space="preserve">Col 3</w:t>
+            </w:r>
+          </w:p>
+        </w:tc>
+      </w:tr>
+      <w:tr>
+        <w:tc>
+          <w:tcPr/>
+          <w:p>
+            <w:pPr/>
+            <w:r>
+              <w:t xml:space="preserve">A</w:t>
+            </w:r>
+          </w:p>
+        </w:tc>
+        <w:tc>
+          <w:tcPr/>
+          <w:p>
+            <w:pPr/>
+            <w:r>
+              <w:t xml:space="preserve">B</w:t>
+            </w:r>
+          </w:p>
+        </w:tc>
+        <w:tc>
+          <w:tcPr/>
+          <w:p>
+            <w:pPr/>
+            <w:r>
+              <w:t xml:space="preserve">C</w:t>
+            </w:r>
+          </w:p>
+        </w:tc>
+      </w:tr>
+    </w:tbl>
+    <w:p>
+      <w:pPr/>
+      <w:r>
+        <w:t xml:space="preserve">rowspan — tall cell spanning two rows:</w:t>
+      </w:r>
+    </w:p>
+    <w:tbl>
+      <w:tblPr>
+        <w:tblStyle w:val="TableGrid"/>
+        <w:tblBorders>
+          <w:top w:val="single" w:sz="4" w:space="0" w:color="auto"/>
+          <w:left w:val="single" w:sz="4" w:space="0" w:color="auto"/>
+          <w:bottom w:val="single" w:sz="4" w:space="0" w:color="auto"/>
+          <w:right w:val="single" w:sz="4" w:space="0" w:color="auto"/>
+          <w:insideH w:val="single" w:sz="4" w:space="0" w:color="auto"/>
+          <w:insideV w:val="single" w:sz="4" w:space="0" w:color="auto"/>
+        </w:tblBorders>
+      </w:tblPr>
+      <w:tr>
+        <w:tc>
+          <w:tcPr>
+            <w:vMerge w:val="restart"/>
+            <w:shd w:val="clear" w:color="auto" w:fill="E2EFDA"/>
+          </w:tcPr>
+          <w:p>
+            <w:pPr>
+              <w:shd w:val="clear" w:color="auto" w:fill="E2EFDA"/>
+            </w:pPr>
+            <w:r>
+              <w:t xml:space="preserve">Tall (rowspan=2)</w:t>
+            </w:r>
+          </w:p>
+        </w:tc>
+        <w:tc>
+          <w:tcPr/>
+          <w:p>
+            <w:pPr/>
+            <w:r>
+              <w:t xml:space="preserve">Row 0, Col 1</w:t>
+            </w:r>
+          </w:p>
+        </w:tc>
+      </w:tr>
+      <w:tr>
+        <w:tc>
+          <w:tcPr>
+            <w:vMerge/>
+          </w:tcPr>
+          <w:p>
+            <w:pPr/>
+            <w:r>
+              <w:t xml:space="preserve"/>
+            </w:r>
+          </w:p>
+        </w:tc>
+        <w:tc>
+          <w:tcPr/>
+          <w:p>
+            <w:pPr/>
+            <w:r>
+              <w:t xml:space="preserve">Row 1, Col 1</w:t>
+            </w:r>
+          </w:p>
+        </w:tc>
+      </w:tr>
+    </w:tbl>
+    <w:p>
+      <w:pPr/>
+      <w:r>
+        <w:t xml:space="preserve">colgroup with explicit column widths:</w:t>
+      </w:r>
+    </w:p>
+    <w:tbl>
+      <w:tblPr>
+        <w:tblStyle w:val="TableGrid"/>
+        <w:tblBorders>
+          <w:top w:val="single" w:sz="4" w:space="0" w:color="auto"/>
+          <w:left w:val="single" w:sz="4" w:space="0" w:color="auto"/>
+          <w:bottom w:val="single" w:sz="4" w:space="0" w:color="auto"/>
+          <w:right w:val="single" w:sz="4" w:space="0" w:color="auto"/>
+          <w:insideH w:val="single" w:sz="4" w:space="0" w:color="auto"/>
+          <w:insideV w:val="single" w:sz="4" w:space="0" w:color="auto"/>
+        </w:tblBorders>
+      </w:tblPr>
+      <w:tblGrid>
+        <w:gridCol w:w="3000"/>
+        <w:gridCol w:w="2000"/>
+        <w:gridCol w:w="2000"/>
+      </w:tblGrid>
+      <w:tr>
+        <w:tc>
+          <w:tcPr/>
+          <w:p>
+            <w:pPr/>
+            <w:r>
+              <w:rPr>
+                <w:b/>
+              </w:rPr>
+              <w:t xml:space="preserve">Name</w:t>
+            </w:r>
+          </w:p>
+        </w:tc>
+        <w:tc>
+          <w:tcPr/>
+          <w:p>
+            <w:pPr/>
+            <w:r>
+              <w:rPr>
+                <w:b/>
+              </w:rPr>
+              <w:t xml:space="preserve">Role</w:t>
+            </w:r>
+          </w:p>
+        </w:tc>
+        <w:tc>
+          <w:tcPr/>
+          <w:p>
+            <w:pPr/>
+            <w:r>
+              <w:rPr>
+                <w:b/>
+              </w:rPr>
+              <w:t xml:space="preserve">Score</w:t>
+            </w:r>
+          </w:p>
+        </w:tc>
+      </w:tr>
+      <w:tr>
+        <w:tc>
+          <w:tcPr/>
+          <w:p>
+            <w:pPr/>
+            <w:r>
+              <w:t xml:space="preserve">Alice</w:t>
+            </w:r>
+          </w:p>
+        </w:tc>
+        <w:tc>
+          <w:tcPr/>
+          <w:p>
+            <w:pPr/>
+            <w:r>
+              <w:t xml:space="preserve">Engineer</w:t>
+            </w:r>
+          </w:p>
+        </w:tc>
+        <w:tc>
+          <w:tcPr/>
+          <w:p>
+            <w:pPr/>
+            <w:r>
+              <w:t xml:space="preserve">95</w:t>
+            </w:r>
+          </w:p>
+        </w:tc>
+      </w:tr>
+      <w:tr>
+        <w:tc>
+          <w:tcPr/>
+          <w:p>
+            <w:pPr/>
+            <w:r>
+              <w:t xml:space="preserve">Bob</w:t>
+            </w:r>
+          </w:p>
+        </w:tc>
+        <w:tc>
+          <w:tcPr/>
+          <w:p>
+            <w:pPr/>
+            <w:r>
+              <w:t xml:space="preserve">Designer</w:t>
+            </w:r>
+          </w:p>
+        </w:tc>
+        <w:tc>
+          <w:tcPr/>
+          <w:p>
+            <w:pPr/>
+            <w:r>
+              <w:t xml:space="preserve">88</w:t>
+            </w:r>
+          </w:p>
+        </w:tc>
+      </w:tr>
+    </w:tbl>
     <w:p>
       <w:pPr>
         <w:pStyle w:val="Heading2"/>

</xml_diff>

<commit_message>
fix: default table to full text width with even column distribution
Without an explicit CSS width or <colgroup>, tables rendered at minimum
content width in Pages/Word (all columns squished). Now defaults to
451.28pt (A4 text width) and distributes evenly across columns when no
<colgroup> widths are found.

Co-Authored-By: Claude Sonnet 4.6 <noreply@anthropic.com>
</commit_message>
<xml_diff>
--- a/tests/fixtures/generic_showcase.docx
+++ b/tests/fixtures/generic_showcase.docx
@@ -483,6 +483,7 @@
     <w:tbl>
       <w:tblPr>
         <w:tblStyle w:val="TableGrid"/>
+        <w:tblW w:w="9026" w:type="dxa"/>
         <w:tblBorders>
           <w:top w:val="single" w:sz="4" w:space="0" w:color="auto"/>
           <w:left w:val="single" w:sz="4" w:space="0" w:color="auto"/>
@@ -492,6 +493,12 @@
           <w:insideV w:val="single" w:sz="4" w:space="0" w:color="auto"/>
         </w:tblBorders>
       </w:tblPr>
+      <w:tblGrid>
+        <w:gridCol w:w="2256"/>
+        <w:gridCol w:w="2256"/>
+        <w:gridCol w:w="2256"/>
+        <w:gridCol w:w="2256"/>
+      </w:tblGrid>
       <w:tr>
         <w:tc>
           <w:tcPr/>
@@ -628,6 +635,7 @@
     <w:tbl>
       <w:tblPr>
         <w:tblStyle w:val="TableGrid"/>
+        <w:tblW w:w="9026" w:type="dxa"/>
         <w:tblBorders>
           <w:top w:val="single" w:sz="4" w:space="0" w:color="auto"/>
           <w:left w:val="single" w:sz="4" w:space="0" w:color="auto"/>
@@ -637,6 +645,11 @@
           <w:insideV w:val="single" w:sz="4" w:space="0" w:color="auto"/>
         </w:tblBorders>
       </w:tblPr>
+      <w:tblGrid>
+        <w:gridCol w:w="3009"/>
+        <w:gridCol w:w="3009"/>
+        <w:gridCol w:w="3009"/>
+      </w:tblGrid>
       <w:tr>
         <w:tc>
           <w:tcPr>
@@ -701,6 +714,7 @@
     <w:tbl>
       <w:tblPr>
         <w:tblStyle w:val="TableGrid"/>
+        <w:tblW w:w="9026" w:type="dxa"/>
         <w:tblBorders>
           <w:top w:val="single" w:sz="4" w:space="0" w:color="auto"/>
           <w:left w:val="single" w:sz="4" w:space="0" w:color="auto"/>
@@ -710,6 +724,10 @@
           <w:insideV w:val="single" w:sz="4" w:space="0" w:color="auto"/>
         </w:tblBorders>
       </w:tblPr>
+      <w:tblGrid>
+        <w:gridCol w:w="4513"/>
+        <w:gridCol w:w="4513"/>
+      </w:tblGrid>
       <w:tr>
         <w:tc>
           <w:tcPr>
@@ -767,6 +785,7 @@
     <w:tbl>
       <w:tblPr>
         <w:tblStyle w:val="TableGrid"/>
+        <w:tblW w:w="9026" w:type="dxa"/>
         <w:tblBorders>
           <w:top w:val="single" w:sz="4" w:space="0" w:color="auto"/>
           <w:left w:val="single" w:sz="4" w:space="0" w:color="auto"/>

</xml_diff>

<commit_message>
feat: CSS border support for generic HTML tables
Model:
- Add BorderDef (style, width_pt, color) and TableBorders (per-side) to
  models/table.py
- Add optional borders field to Table and TableCell

Writer:
- _write_tbl_pr uses table.borders when set; falls back to single-line
  default when None (backward compat for tables parsed from DOCX)
- _write_cell emits w:tcBorders from cell.borders when set
- Shared _write_border_el helper

Generic HTML parser:
- _parse_border_shorthand parses CSS border shorthand → BorderDef
- _parse_table_borders reads border/border-top/right/bottom/left CSS and
  HTML border attribute from <table>
- _parse_cell_borders reads per-side CSS from <td>/<th>
- CSS styles mapped: solid→single, dashed, dotted, double, groove/ridge,
  inset/outset, none/hidden→none
- border="0" suppresses all borders; border="N" sets visible border

Tests: 14 new border tests (table-level + cell-level)

Co-Authored-By: Claude Sonnet 4.6 <noreply@anthropic.com>
</commit_message>
<xml_diff>
--- a/tests/fixtures/generic_showcase.docx
+++ b/tests/fixtures/generic_showcase.docx
@@ -892,6 +892,144 @@
             <w:pPr/>
             <w:r>
               <w:t xml:space="preserve">88</w:t>
+            </w:r>
+          </w:p>
+        </w:tc>
+      </w:tr>
+    </w:tbl>
+    <w:p>
+      <w:pPr/>
+      <w:r>
+        <w:t xml:space="preserve">Custom borders — red outer, dashed inner cells, no-border cell:</w:t>
+      </w:r>
+    </w:p>
+    <w:tbl>
+      <w:tblPr>
+        <w:tblStyle w:val="TableGrid"/>
+        <w:tblW w:w="9026" w:type="dxa"/>
+        <w:tblBorders>
+          <w:top w:val="single" w:sz="16" w:space="0" w:color="C00000"/>
+          <w:left w:val="single" w:sz="16" w:space="0" w:color="C00000"/>
+          <w:bottom w:val="single" w:sz="16" w:space="0" w:color="C00000"/>
+          <w:right w:val="single" w:sz="16" w:space="0" w:color="C00000"/>
+          <w:insideH w:val="single" w:sz="16" w:space="0" w:color="C00000"/>
+          <w:insideV w:val="single" w:sz="16" w:space="0" w:color="C00000"/>
+        </w:tblBorders>
+      </w:tblPr>
+      <w:tblGrid>
+        <w:gridCol w:w="3009"/>
+        <w:gridCol w:w="3009"/>
+        <w:gridCol w:w="3009"/>
+      </w:tblGrid>
+      <w:tr>
+        <w:tc>
+          <w:tcPr/>
+          <w:p>
+            <w:pPr/>
+            <w:r>
+              <w:t xml:space="preserve">Default cell</w:t>
+            </w:r>
+          </w:p>
+        </w:tc>
+        <w:tc>
+          <w:tcPr>
+            <w:tcBorders>
+              <w:top w:val="dashed" w:sz="8" w:space="0" w:color="0070C0"/>
+              <w:left w:val="dashed" w:sz="8" w:space="0" w:color="0070C0"/>
+              <w:bottom w:val="dashed" w:sz="8" w:space="0" w:color="0070C0"/>
+              <w:right w:val="dashed" w:sz="8" w:space="0" w:color="0070C0"/>
+            </w:tcBorders>
+          </w:tcPr>
+          <w:p>
+            <w:pPr/>
+            <w:r>
+              <w:t xml:space="preserve">Dashed blue border</w:t>
+            </w:r>
+          </w:p>
+        </w:tc>
+        <w:tc>
+          <w:tcPr>
+            <w:tcBorders>
+              <w:top w:val="none" w:sz="0" w:space="0" w:color="auto"/>
+              <w:left w:val="none" w:sz="0" w:space="0" w:color="auto"/>
+              <w:bottom w:val="none" w:sz="0" w:space="0" w:color="auto"/>
+              <w:right w:val="none" w:sz="0" w:space="0" w:color="auto"/>
+            </w:tcBorders>
+          </w:tcPr>
+          <w:p>
+            <w:pPr/>
+            <w:r>
+              <w:t xml:space="preserve">No border</w:t>
+            </w:r>
+          </w:p>
+        </w:tc>
+      </w:tr>
+    </w:tbl>
+    <w:p>
+      <w:pPr/>
+      <w:r>
+        <w:t xml:space="preserve">Table with border=0 (no borders):</w:t>
+      </w:r>
+    </w:p>
+    <w:tbl>
+      <w:tblPr>
+        <w:tblStyle w:val="TableGrid"/>
+        <w:tblW w:w="9026" w:type="dxa"/>
+        <w:tblBorders>
+          <w:top w:val="none" w:sz="0" w:space="0" w:color="auto"/>
+          <w:left w:val="none" w:sz="0" w:space="0" w:color="auto"/>
+          <w:bottom w:val="none" w:sz="0" w:space="0" w:color="auto"/>
+          <w:right w:val="none" w:sz="0" w:space="0" w:color="auto"/>
+          <w:insideH w:val="none" w:sz="0" w:space="0" w:color="auto"/>
+          <w:insideV w:val="none" w:sz="0" w:space="0" w:color="auto"/>
+        </w:tblBorders>
+      </w:tblPr>
+      <w:tblGrid>
+        <w:gridCol w:w="4513"/>
+        <w:gridCol w:w="4513"/>
+      </w:tblGrid>
+      <w:tr>
+        <w:tc>
+          <w:tcPr/>
+          <w:p>
+            <w:pPr/>
+            <w:r>
+              <w:rPr>
+                <w:b/>
+              </w:rPr>
+              <w:t xml:space="preserve">Col A</w:t>
+            </w:r>
+          </w:p>
+        </w:tc>
+        <w:tc>
+          <w:tcPr/>
+          <w:p>
+            <w:pPr/>
+            <w:r>
+              <w:rPr>
+                <w:b/>
+              </w:rPr>
+              <w:t xml:space="preserve">Col B</w:t>
+            </w:r>
+          </w:p>
+        </w:tc>
+      </w:tr>
+      <w:tr>
+        <w:tc>
+          <w:tcPr/>
+          <w:p>
+            <w:pPr/>
+            <w:r>
+              <w:t xml:space="preserve">Data 1</w:t>
+            </w:r>
+          </w:p>
+        </w:tc>
+        <w:tc>
+          <w:tcPr/>
+          <w:p>
+            <w:pPr/>
+            <w:r>
+              <w:t xml:space="preserve">Data 2</w:t>
             </w:r>
           </w:p>
         </w:tc>

</xml_diff>

<commit_message>
feat: generic HTML image parsing (data: URIs, fetch_images, auto-sizing)
- <img src="data:..."> — decodes base64 data URI into InlineImage
- <img src="https://..."> with fetch_images=True — downloads image,
  detects content type from Content-Type header or URL extension
- Dimensions resolved in order: CSS width/height → HTML attributes →
  Pillow natural pixel size (96 dpi) → proportional scaling when only
  one dimension specified → 200×150pt fallback
- Block-level <img> wrapped in a paragraph; inline <img> emitted as
  ImageRun within the surrounding paragraph's run list
- Relative/local URLs warned and skipped; fetch_images=False warns on
  remote URLs (matches existing fetch_external_css pattern)
- 17 tests covering data URIs, natural sizing, explicit dimensions,
  proportional scaling, CSS override, round-trip, warn-on-skip
- Phase 2 complete — README updated (Images ✅ shipped)

Co-Authored-By: Claude Sonnet 4.6 <noreply@anthropic.com>
</commit_message>
<xml_diff>
--- a/tests/fixtures/generic_showcase.docx
+++ b/tests/fixtures/generic_showcase.docx
@@ -393,7 +393,7 @@
       <w:r>
         <w:t xml:space="preserve">Step two with </w:t>
       </w:r>
-      <w:hyperlink r:id="rId4">
+      <w:hyperlink r:id="rId6">
         <w:r>
           <w:t xml:space="preserve">a link</w:t>
         </w:r>
@@ -1453,7 +1453,7 @@
       <w:r>
         <w:t xml:space="preserve">Visit </w:t>
       </w:r>
-      <w:hyperlink r:id="rId4">
+      <w:hyperlink r:id="rId6">
         <w:r>
           <w:t xml:space="preserve">docwow documentation</w:t>
         </w:r>
@@ -1467,7 +1467,7 @@
       <w:r>
         <w:t xml:space="preserve">Bold link: </w:t>
       </w:r>
-      <w:hyperlink r:id="rId5">
+      <w:hyperlink r:id="rId7">
         <w:r>
           <w:rPr>
             <w:b/>
@@ -1484,7 +1484,7 @@
       <w:r>
         <w:t xml:space="preserve">Email: </w:t>
       </w:r>
-      <w:hyperlink r:id="rId6">
+      <w:hyperlink r:id="rId8">
         <w:r>
           <w:t xml:space="preserve">hello@example.com</w:t>
         </w:r>
@@ -1554,6 +1554,100 @@
       </w:r>
       <w:r>
         <w:t xml:space="preserve"> plain.</w:t>
+      </w:r>
+    </w:p>
+    <w:p>
+      <w:pPr>
+        <w:pStyle w:val="Heading2"/>
+      </w:pPr>
+      <w:r>
+        <w:t xml:space="preserve">Images</w:t>
+      </w:r>
+    </w:p>
+    <w:p>
+      <w:pPr/>
+      <w:r>
+        <w:t xml:space="preserve">Inline image at 90pt × 45pt (explicit dimensions via attributes):</w:t>
+      </w:r>
+    </w:p>
+    <w:p>
+      <w:pPr/>
+      <w:r>
+        <w:drawing>
+          <wp:inline distT="0" distB="0" distL="0" distR="0">
+            <wp:extent cx="1143000" cy="571500"/>
+            <wp:effectExtent l="0" t="0" r="0" b="0"/>
+            <wp:docPr id="1" name="Image1"/>
+            <a:graphic>
+              <a:graphicData uri="http://schemas.openxmlformats.org/drawingml/2006/picture">
+                <pic:pic>
+                  <pic:nvPicPr>
+                    <pic:cNvPr id="0" name="Image1"/>
+                    <pic:cNvPicPr/>
+                  </pic:nvPicPr>
+                  <pic:blipFill>
+                    <a:blip r:embed="rId1"/>
+                    <a:stretch>
+                      <a:fillRect/>
+                    </a:stretch>
+                  </pic:blipFill>
+                  <pic:spPr>
+                    <a:xfrm>
+                      <a:off x="0" y="0"/>
+                      <a:ext cx="1143000" cy="571500"/>
+                    </a:xfrm>
+                    <a:prstGeom prst="rect">
+                      <a:avLst/>
+                    </a:prstGeom>
+                  </pic:spPr>
+                </pic:pic>
+              </a:graphicData>
+            </a:graphic>
+          </wp:inline>
+        </w:drawing>
+      </w:r>
+    </w:p>
+    <w:p>
+      <w:pPr/>
+      <w:r>
+        <w:t xml:space="preserve">Natural-size image (no width/height — Pillow reads pixel dimensions):</w:t>
+      </w:r>
+    </w:p>
+    <w:p>
+      <w:pPr/>
+      <w:r>
+        <w:drawing>
+          <wp:inline distT="0" distB="0" distL="0" distR="0">
+            <wp:extent cx="1143000" cy="571500"/>
+            <wp:effectExtent l="0" t="0" r="0" b="0"/>
+            <wp:docPr id="2" name="Image2"/>
+            <a:graphic>
+              <a:graphicData uri="http://schemas.openxmlformats.org/drawingml/2006/picture">
+                <pic:pic>
+                  <pic:nvPicPr>
+                    <pic:cNvPr id="0" name="Image2"/>
+                    <pic:cNvPicPr/>
+                  </pic:nvPicPr>
+                  <pic:blipFill>
+                    <a:blip r:embed="rId2"/>
+                    <a:stretch>
+                      <a:fillRect/>
+                    </a:stretch>
+                  </pic:blipFill>
+                  <pic:spPr>
+                    <a:xfrm>
+                      <a:off x="0" y="0"/>
+                      <a:ext cx="1143000" cy="571500"/>
+                    </a:xfrm>
+                    <a:prstGeom prst="rect">
+                      <a:avLst/>
+                    </a:prstGeom>
+                  </pic:spPr>
+                </pic:pic>
+              </a:graphicData>
+            </a:graphic>
+          </wp:inline>
+        </w:drawing>
       </w:r>
     </w:p>
     <w:sectPr>

</xml_diff>